<commit_message>
Add two-step agreement signing workflow
</commit_message>
<xml_diff>
--- a/agreement_templates/baa_privacy_agreement.docx
+++ b/agreement_templates/baa_privacy_agreement.docx
@@ -37,6 +37,17 @@
       <w:pPr>
         <w:spacing w:after="120" w:line="240" w:lineRule="auto"/>
         <w:rPr>
+          <w:b/>
+          <w:bCs/>
+          <w:sz w:val="24"/>
+          <w:szCs w:val="24"/>
+        </w:rPr>
+      </w:pPr>
+    </w:p>
+    <w:p>
+      <w:pPr>
+        <w:spacing w:after="120" w:line="240" w:lineRule="auto"/>
+        <w:rPr>
           <w:sz w:val="21"/>
           <w:szCs w:val="21"/>
         </w:rPr>
@@ -556,364 +567,6 @@
           <w:szCs w:val="21"/>
         </w:rPr>
       </w:pPr>
-    </w:p>
-    <w:p>
-      <w:pPr>
-        <w:spacing w:after="120" w:line="240" w:lineRule="auto"/>
-        <w:rPr>
-          <w:b/>
-          <w:bCs/>
-        </w:rPr>
-      </w:pPr>
-      <w:r>
-        <w:rPr>
-          <w:b/>
-          <w:bCs/>
-        </w:rPr>
-        <w:t>Signatures:</w:t>
-      </w:r>
-    </w:p>
-    <w:p>
-      <w:pPr>
-        <w:spacing w:after="120" w:line="240" w:lineRule="auto"/>
-      </w:pPr>
-      <w:r>
-        <w:t>Covered Entity:</w:t>
-      </w:r>
-      <w:r>
-        <w:rPr>
-          <w:noProof/>
-        </w:rPr>
-        <mc:AlternateContent>
-          <mc:Choice Requires="wpg">
-            <w:drawing>
-              <wp:inline distT="114300" distB="114300" distL="114300" distR="114300" wp14:anchorId="2A0148B4" wp14:editId="0E4EE009">
-                <wp:extent cx="1638300" cy="400050"/>
-                <wp:effectExtent l="0" t="0" r="0" b="0"/>
-                <wp:docPr id="2" name="Group 2"/>
-                <wp:cNvGraphicFramePr/>
-                <a:graphic xmlns:a="http://schemas.openxmlformats.org/drawingml/2006/main">
-                  <a:graphicData uri="http://schemas.microsoft.com/office/word/2010/wordprocessingGroup">
-                    <wpg:wgp>
-                      <wpg:cNvGrpSpPr/>
-                      <wpg:grpSpPr>
-                        <a:xfrm>
-                          <a:off x="0" y="0"/>
-                          <a:ext cx="1638300" cy="400050"/>
-                          <a:chOff x="0" y="0"/>
-                          <a:chExt cx="1638300" cy="400050"/>
-                        </a:xfrm>
-                      </wpg:grpSpPr>
-                      <wps:wsp>
-                        <wps:cNvPr id="1952604155" name="Rectangle 1952604155"/>
-                        <wps:cNvSpPr/>
-                        <wps:spPr>
-                          <a:xfrm>
-                            <a:off x="0" y="0"/>
-                            <a:ext cx="1638300" cy="400050"/>
-                          </a:xfrm>
-                          <a:prstGeom prst="rect">
-                            <a:avLst/>
-                          </a:prstGeom>
-                          <a:noFill/>
-                        </wps:spPr>
-                        <wps:bodyPr/>
-                      </wps:wsp>
-                      <wps:wsp>
-                        <wps:cNvPr id="1657241799" name="Straight Connector 1657241799"/>
-                        <wps:cNvCnPr/>
-                        <wps:spPr>
-                          <a:xfrm>
-                            <a:off x="0" y="400050"/>
-                            <a:ext cx="1638300" cy="0"/>
-                          </a:xfrm>
-                          <a:prstGeom prst="line">
-                            <a:avLst/>
-                          </a:prstGeom>
-                          <a:noFill/>
-                          <a:ln w="23812">
-                            <a:solidFill>
-                              <a:srgbClr val="000000"/>
-                            </a:solidFill>
-                          </a:ln>
-                        </wps:spPr>
-                        <wps:bodyPr/>
-                      </wps:wsp>
-                    </wpg:wgp>
-                  </a:graphicData>
-                </a:graphic>
-              </wp:inline>
-            </w:drawing>
-          </mc:Choice>
-          <mc:Fallback xmlns:cr="http://schemas.microsoft.com/office/comments/2020/reactions" xmlns="http://schemas.microsoft.com/office/tasks/2019/documenttasks" xmlns:dgm="http://schemas.openxmlformats.org/drawingml/2006/diagram" xmlns:lc="http://schemas.openxmlformats.org/drawingml/2006/lockedCanvas" xmlns:c="http://schemas.openxmlformats.org/drawingml/2006/chart" xmlns:pic="http://schemas.openxmlformats.org/drawingml/2006/picture" xmlns:a="http://schemas.openxmlformats.org/drawingml/2006/main" xmlns:sl="http://schemas.openxmlformats.org/schemaLibrary/2006/main">
-            <w:drawing>
-              <wp:inline>
-                <wp:extent cx="0" cy="0"/>
-                <wp:docPr id="0"/>
-                <a:graphic>
-                  <a:graphicData/>
-                </a:graphic>
-              </wp:inline>
-            </w:drawing>
-          </mc:Fallback>
-        </mc:AlternateContent>
-      </w:r>
-      <w:r>
-        <w:t xml:space="preserve"> Date: </w:t>
-      </w:r>
-      <w:r>
-        <w:rPr>
-          <w:noProof/>
-        </w:rPr>
-        <mc:AlternateContent>
-          <mc:Choice Requires="wpg">
-            <w:drawing>
-              <wp:inline distT="114300" distB="114300" distL="114300" distR="114300" wp14:anchorId="02F5670E" wp14:editId="1B7F36E4">
-                <wp:extent cx="1638300" cy="400050"/>
-                <wp:effectExtent l="0" t="0" r="0" b="0"/>
-                <wp:docPr id="4" name="Group 4"/>
-                <wp:cNvGraphicFramePr/>
-                <a:graphic xmlns:a="http://schemas.openxmlformats.org/drawingml/2006/main">
-                  <a:graphicData uri="http://schemas.microsoft.com/office/word/2010/wordprocessingGroup">
-                    <wpg:wgp>
-                      <wpg:cNvGrpSpPr/>
-                      <wpg:grpSpPr>
-                        <a:xfrm>
-                          <a:off x="0" y="0"/>
-                          <a:ext cx="1638300" cy="400050"/>
-                          <a:chOff x="0" y="0"/>
-                          <a:chExt cx="1638300" cy="400050"/>
-                        </a:xfrm>
-                      </wpg:grpSpPr>
-                      <wps:wsp>
-                        <wps:cNvPr id="250827737" name="Rectangle 250827737"/>
-                        <wps:cNvSpPr/>
-                        <wps:spPr>
-                          <a:xfrm>
-                            <a:off x="0" y="0"/>
-                            <a:ext cx="1638300" cy="400050"/>
-                          </a:xfrm>
-                          <a:prstGeom prst="rect">
-                            <a:avLst/>
-                          </a:prstGeom>
-                          <a:noFill/>
-                        </wps:spPr>
-                        <wps:bodyPr/>
-                      </wps:wsp>
-                      <wps:wsp>
-                        <wps:cNvPr id="1805847098" name="Straight Connector 1805847098"/>
-                        <wps:cNvCnPr/>
-                        <wps:spPr>
-                          <a:xfrm>
-                            <a:off x="0" y="400050"/>
-                            <a:ext cx="1638300" cy="0"/>
-                          </a:xfrm>
-                          <a:prstGeom prst="line">
-                            <a:avLst/>
-                          </a:prstGeom>
-                          <a:noFill/>
-                          <a:ln w="23812">
-                            <a:solidFill>
-                              <a:srgbClr val="000000"/>
-                            </a:solidFill>
-                          </a:ln>
-                        </wps:spPr>
-                        <wps:bodyPr/>
-                      </wps:wsp>
-                    </wpg:wgp>
-                  </a:graphicData>
-                </a:graphic>
-              </wp:inline>
-            </w:drawing>
-          </mc:Choice>
-          <mc:Fallback xmlns:cr="http://schemas.microsoft.com/office/comments/2020/reactions" xmlns="http://schemas.microsoft.com/office/tasks/2019/documenttasks" xmlns:dgm="http://schemas.openxmlformats.org/drawingml/2006/diagram" xmlns:lc="http://schemas.openxmlformats.org/drawingml/2006/lockedCanvas" xmlns:c="http://schemas.openxmlformats.org/drawingml/2006/chart" xmlns:pic="http://schemas.openxmlformats.org/drawingml/2006/picture" xmlns:a="http://schemas.openxmlformats.org/drawingml/2006/main" xmlns:sl="http://schemas.openxmlformats.org/schemaLibrary/2006/main">
-            <w:drawing>
-              <wp:inline>
-                <wp:extent cx="0" cy="0"/>
-                <wp:docPr id="0"/>
-                <a:graphic>
-                  <a:graphicData/>
-                </a:graphic>
-              </wp:inline>
-            </w:drawing>
-          </mc:Fallback>
-        </mc:AlternateContent>
-      </w:r>
-    </w:p>
-    <w:p>
-      <w:pPr>
-        <w:spacing w:after="120" w:line="240" w:lineRule="auto"/>
-      </w:pPr>
-      <w:r>
-        <w:t>BA (</w:t>
-      </w:r>
-      <w:proofErr w:type="spellStart"/>
-      <w:r>
-        <w:t>alphaSource</w:t>
-      </w:r>
-      <w:proofErr w:type="spellEnd"/>
-      <w:r>
-        <w:t>):</w:t>
-      </w:r>
-      <w:r>
-        <w:rPr>
-          <w:noProof/>
-        </w:rPr>
-        <mc:AlternateContent>
-          <mc:Choice Requires="wpg">
-            <w:drawing>
-              <wp:inline distT="114300" distB="114300" distL="114300" distR="114300" wp14:anchorId="7A698226" wp14:editId="3CB2DAED">
-                <wp:extent cx="1638300" cy="400050"/>
-                <wp:effectExtent l="0" t="0" r="0" b="0"/>
-                <wp:docPr id="1" name="Group 1"/>
-                <wp:cNvGraphicFramePr/>
-                <a:graphic xmlns:a="http://schemas.openxmlformats.org/drawingml/2006/main">
-                  <a:graphicData uri="http://schemas.microsoft.com/office/word/2010/wordprocessingGroup">
-                    <wpg:wgp>
-                      <wpg:cNvGrpSpPr/>
-                      <wpg:grpSpPr>
-                        <a:xfrm>
-                          <a:off x="0" y="0"/>
-                          <a:ext cx="1638300" cy="400050"/>
-                          <a:chOff x="0" y="0"/>
-                          <a:chExt cx="1638300" cy="400050"/>
-                        </a:xfrm>
-                      </wpg:grpSpPr>
-                      <wps:wsp>
-                        <wps:cNvPr id="1304388947" name="Rectangle 1304388947"/>
-                        <wps:cNvSpPr/>
-                        <wps:spPr>
-                          <a:xfrm>
-                            <a:off x="0" y="0"/>
-                            <a:ext cx="1638300" cy="400050"/>
-                          </a:xfrm>
-                          <a:prstGeom prst="rect">
-                            <a:avLst/>
-                          </a:prstGeom>
-                          <a:noFill/>
-                        </wps:spPr>
-                        <wps:bodyPr/>
-                      </wps:wsp>
-                      <wps:wsp>
-                        <wps:cNvPr id="865553781" name="Straight Connector 865553781"/>
-                        <wps:cNvCnPr/>
-                        <wps:spPr>
-                          <a:xfrm>
-                            <a:off x="0" y="400050"/>
-                            <a:ext cx="1638300" cy="0"/>
-                          </a:xfrm>
-                          <a:prstGeom prst="line">
-                            <a:avLst/>
-                          </a:prstGeom>
-                          <a:noFill/>
-                          <a:ln w="23812">
-                            <a:solidFill>
-                              <a:srgbClr val="000000"/>
-                            </a:solidFill>
-                          </a:ln>
-                        </wps:spPr>
-                        <wps:bodyPr/>
-                      </wps:wsp>
-                    </wpg:wgp>
-                  </a:graphicData>
-                </a:graphic>
-              </wp:inline>
-            </w:drawing>
-          </mc:Choice>
-          <mc:Fallback xmlns:cr="http://schemas.microsoft.com/office/comments/2020/reactions" xmlns="http://schemas.microsoft.com/office/tasks/2019/documenttasks" xmlns:dgm="http://schemas.openxmlformats.org/drawingml/2006/diagram" xmlns:lc="http://schemas.openxmlformats.org/drawingml/2006/lockedCanvas" xmlns:c="http://schemas.openxmlformats.org/drawingml/2006/chart" xmlns:pic="http://schemas.openxmlformats.org/drawingml/2006/picture" xmlns:a="http://schemas.openxmlformats.org/drawingml/2006/main" xmlns:sl="http://schemas.openxmlformats.org/schemaLibrary/2006/main">
-            <w:drawing>
-              <wp:inline>
-                <wp:extent cx="0" cy="0"/>
-                <wp:docPr id="0"/>
-                <a:graphic>
-                  <a:graphicData/>
-                </a:graphic>
-              </wp:inline>
-            </w:drawing>
-          </mc:Fallback>
-        </mc:AlternateContent>
-      </w:r>
-      <w:r>
-        <w:t xml:space="preserve"> Date:</w:t>
-      </w:r>
-      <w:r>
-        <w:rPr>
-          <w:noProof/>
-        </w:rPr>
-        <mc:AlternateContent>
-          <mc:Choice Requires="wpg">
-            <w:drawing>
-              <wp:inline distT="114300" distB="114300" distL="114300" distR="114300" wp14:anchorId="348577F6" wp14:editId="7F57E53D">
-                <wp:extent cx="1638300" cy="400050"/>
-                <wp:effectExtent l="0" t="0" r="0" b="0"/>
-                <wp:docPr id="3" name="Group 3"/>
-                <wp:cNvGraphicFramePr/>
-                <a:graphic xmlns:a="http://schemas.openxmlformats.org/drawingml/2006/main">
-                  <a:graphicData uri="http://schemas.microsoft.com/office/word/2010/wordprocessingGroup">
-                    <wpg:wgp>
-                      <wpg:cNvGrpSpPr/>
-                      <wpg:grpSpPr>
-                        <a:xfrm>
-                          <a:off x="0" y="0"/>
-                          <a:ext cx="1638300" cy="400050"/>
-                          <a:chOff x="0" y="0"/>
-                          <a:chExt cx="1638300" cy="400050"/>
-                        </a:xfrm>
-                      </wpg:grpSpPr>
-                      <wps:wsp>
-                        <wps:cNvPr id="1098314364" name="Rectangle 1098314364"/>
-                        <wps:cNvSpPr/>
-                        <wps:spPr>
-                          <a:xfrm>
-                            <a:off x="0" y="0"/>
-                            <a:ext cx="1638300" cy="400050"/>
-                          </a:xfrm>
-                          <a:prstGeom prst="rect">
-                            <a:avLst/>
-                          </a:prstGeom>
-                          <a:noFill/>
-                        </wps:spPr>
-                        <wps:bodyPr/>
-                      </wps:wsp>
-                      <wps:wsp>
-                        <wps:cNvPr id="432760496" name="Straight Connector 432760496"/>
-                        <wps:cNvCnPr/>
-                        <wps:spPr>
-                          <a:xfrm>
-                            <a:off x="0" y="400050"/>
-                            <a:ext cx="1638300" cy="0"/>
-                          </a:xfrm>
-                          <a:prstGeom prst="line">
-                            <a:avLst/>
-                          </a:prstGeom>
-                          <a:noFill/>
-                          <a:ln w="23812">
-                            <a:solidFill>
-                              <a:srgbClr val="000000"/>
-                            </a:solidFill>
-                          </a:ln>
-                        </wps:spPr>
-                        <wps:bodyPr/>
-                      </wps:wsp>
-                    </wpg:wgp>
-                  </a:graphicData>
-                </a:graphic>
-              </wp:inline>
-            </w:drawing>
-          </mc:Choice>
-          <mc:Fallback xmlns:cr="http://schemas.microsoft.com/office/comments/2020/reactions" xmlns="http://schemas.microsoft.com/office/tasks/2019/documenttasks" xmlns:dgm="http://schemas.openxmlformats.org/drawingml/2006/diagram" xmlns:lc="http://schemas.openxmlformats.org/drawingml/2006/lockedCanvas" xmlns:c="http://schemas.openxmlformats.org/drawingml/2006/chart" xmlns:pic="http://schemas.openxmlformats.org/drawingml/2006/picture" xmlns:a="http://schemas.openxmlformats.org/drawingml/2006/main" xmlns:sl="http://schemas.openxmlformats.org/schemaLibrary/2006/main">
-            <w:drawing>
-              <wp:inline>
-                <wp:extent cx="0" cy="0"/>
-                <wp:docPr id="0"/>
-                <a:graphic>
-                  <a:graphicData/>
-                </a:graphic>
-              </wp:inline>
-            </w:drawing>
-          </mc:Fallback>
-        </mc:AlternateContent>
-      </w:r>
     </w:p>
     <w:sectPr>
       <w:headerReference w:type="default" r:id="rId9"/>
@@ -981,32 +634,34 @@
   <w:p>
     <w:pPr>
       <w:spacing w:after="160" w:line="301" w:lineRule="auto"/>
-      <w:jc w:val="center"/>
     </w:pPr>
     <w:r>
       <w:rPr>
-        <w:b/>
-        <w:bCs/>
         <w:noProof/>
-        <w:sz w:val="26"/>
-        <w:szCs w:val="26"/>
       </w:rPr>
       <w:drawing>
-        <wp:inline distT="114300" distB="114300" distL="114300" distR="114300" wp14:anchorId="43D1C653" wp14:editId="61B233F2">
-          <wp:extent cx="5908974" cy="1157288"/>
+        <wp:inline distT="0" distB="0" distL="0" distR="0" wp14:anchorId="4D448113" wp14:editId="2ECB6F5A">
+          <wp:extent cx="5901267" cy="1402812"/>
           <wp:effectExtent l="0" t="0" r="0" b="0"/>
-          <wp:docPr id="5" name="image1.png"/>
-          <wp:cNvGraphicFramePr/>
+          <wp:docPr id="683250449" name="Picture 3"/>
+          <wp:cNvGraphicFramePr>
+            <a:graphicFrameLocks xmlns:a="http://schemas.openxmlformats.org/drawingml/2006/main" noChangeAspect="1"/>
+          </wp:cNvGraphicFramePr>
           <a:graphic xmlns:a="http://schemas.openxmlformats.org/drawingml/2006/main">
             <a:graphicData uri="http://schemas.openxmlformats.org/drawingml/2006/picture">
               <pic:pic xmlns:pic="http://schemas.openxmlformats.org/drawingml/2006/picture">
                 <pic:nvPicPr>
-                  <pic:cNvPr id="0" name="image1.png"/>
-                  <pic:cNvPicPr preferRelativeResize="0"/>
+                  <pic:cNvPr id="683250449" name="Picture 683250449"/>
+                  <pic:cNvPicPr/>
                 </pic:nvPicPr>
                 <pic:blipFill>
-                  <a:blip r:embed="rId1"/>
-                  <a:srcRect/>
+                  <a:blip r:embed="rId1">
+                    <a:extLst>
+                      <a:ext uri="{28A0092B-C50C-407E-A947-70E740481C1C}">
+                        <a14:useLocalDpi xmlns:a14="http://schemas.microsoft.com/office/drawing/2010/main" val="0"/>
+                      </a:ext>
+                    </a:extLst>
+                  </a:blip>
                   <a:stretch>
                     <a:fillRect/>
                   </a:stretch>
@@ -1014,12 +669,11 @@
                 <pic:spPr>
                   <a:xfrm>
                     <a:off x="0" y="0"/>
-                    <a:ext cx="5908974" cy="1157288"/>
+                    <a:ext cx="6230985" cy="1481190"/>
                   </a:xfrm>
                   <a:prstGeom prst="rect">
                     <a:avLst/>
                   </a:prstGeom>
-                  <a:ln/>
                 </pic:spPr>
               </pic:pic>
             </a:graphicData>
@@ -1736,6 +1390,50 @@
       <w:szCs w:val="30"/>
     </w:rPr>
   </w:style>
+  <w:style w:type="paragraph" w:styleId="Header">
+    <w:name w:val="header"/>
+    <w:basedOn w:val="Normal"/>
+    <w:link w:val="HeaderChar"/>
+    <w:uiPriority w:val="99"/>
+    <w:unhideWhenUsed/>
+    <w:rsid w:val="00D1112C"/>
+    <w:pPr>
+      <w:tabs>
+        <w:tab w:val="center" w:pos="4680"/>
+        <w:tab w:val="right" w:pos="9360"/>
+      </w:tabs>
+      <w:spacing w:line="240" w:lineRule="auto"/>
+    </w:pPr>
+  </w:style>
+  <w:style w:type="character" w:customStyle="1" w:styleId="HeaderChar">
+    <w:name w:val="Header Char"/>
+    <w:basedOn w:val="DefaultParagraphFont"/>
+    <w:link w:val="Header"/>
+    <w:uiPriority w:val="99"/>
+    <w:rsid w:val="00D1112C"/>
+  </w:style>
+  <w:style w:type="paragraph" w:styleId="Footer">
+    <w:name w:val="footer"/>
+    <w:basedOn w:val="Normal"/>
+    <w:link w:val="FooterChar"/>
+    <w:uiPriority w:val="99"/>
+    <w:unhideWhenUsed/>
+    <w:rsid w:val="00D1112C"/>
+    <w:pPr>
+      <w:tabs>
+        <w:tab w:val="center" w:pos="4680"/>
+        <w:tab w:val="right" w:pos="9360"/>
+      </w:tabs>
+      <w:spacing w:line="240" w:lineRule="auto"/>
+    </w:pPr>
+  </w:style>
+  <w:style w:type="character" w:customStyle="1" w:styleId="FooterChar">
+    <w:name w:val="Footer Char"/>
+    <w:basedOn w:val="DefaultParagraphFont"/>
+    <w:link w:val="Footer"/>
+    <w:uiPriority w:val="99"/>
+    <w:rsid w:val="00D1112C"/>
+  </w:style>
 </w:styles>
 </file>
 
@@ -2060,6 +1758,12 @@
 </file>
 
 <file path=customXml/item1.xml><?xml version="1.0" encoding="utf-8"?>
+<go:gDocsCustomXmlDataStorage xmlns:go="http://customooxmlschemas.google.com/" xmlns:r="http://schemas.openxmlformats.org/officeDocument/2006/relationships" uri="GoogleDocsCustomDataVersion2">
+  <go:docsCustomData xmlns:go="http://customooxmlschemas.google.com/" roundtripDataSignature="AMtx7miH7vMcjt0O58+FOcJACWVo3P60ZQ==">CgMxLjA4AHIhMVY4ZFJ3ZXRVQXpzdXFmRy1MeEVadWQydzg2c0FzSzBj</go:docsCustomData>
+</go:gDocsCustomXmlDataStorage>
+</file>
+
+<file path=customXml/item2.xml><?xml version="1.0" encoding="utf-8"?>
 <go:Signers xmlns:go="http://customooxmlschemas.google.com/" xmlns:r="http://schemas.openxmlformats.org/officeDocument/2006/relationships">
   <go:Signer>
     <go:Gdesa>{"SignerLabel":"Jason","SignerId":"esignature.hbw9ek65y909","SignerColor":"#e8f0fe","SignerIndex":"1"}</go:Gdesa>
@@ -2070,14 +1774,8 @@
 </go:Signers>
 </file>
 
-<file path=customXml/item2.xml><?xml version="1.0" encoding="utf-8"?>
-<go:gDocsCustomXmlDataStorage xmlns:go="http://customooxmlschemas.google.com/" xmlns:r="http://schemas.openxmlformats.org/officeDocument/2006/relationships" uri="GoogleDocsCustomDataVersion2">
-  <go:docsCustomData xmlns:go="http://customooxmlschemas.google.com/" roundtripDataSignature="AMtx7miH7vMcjt0O58+FOcJACWVo3P60ZQ==">CgMxLjA4AHIhMVY4ZFJ3ZXRVQXpzdXFmRy1MeEVadWQydzg2c0FzSzBj</go:docsCustomData>
-</go:gDocsCustomXmlDataStorage>
-</file>
-
 <file path=customXml/itemProps1.xml><?xml version="1.0" encoding="utf-8"?>
-<ds:datastoreItem xmlns:ds="http://schemas.openxmlformats.org/officeDocument/2006/customXml" ds:itemID="{803773BB-12E9-3D42-901A-E48B4C5B058A}">
+<ds:datastoreItem xmlns:ds="http://schemas.openxmlformats.org/officeDocument/2006/customXml" ds:itemID="{11111111-1234-1234-1234-123412341234}">
   <ds:schemaRefs>
     <ds:schemaRef ds:uri="http://customooxmlschemas.google.com/"/>
     <ds:schemaRef ds:uri="http://schemas.openxmlformats.org/officeDocument/2006/relationships"/>
@@ -2086,7 +1784,7 @@
 </file>
 
 <file path=customXml/itemProps2.xml><?xml version="1.0" encoding="utf-8"?>
-<ds:datastoreItem xmlns:ds="http://schemas.openxmlformats.org/officeDocument/2006/customXml" ds:itemID="{11111111-1234-1234-1234-123412341234}">
+<ds:datastoreItem xmlns:ds="http://schemas.openxmlformats.org/officeDocument/2006/customXml" ds:itemID="{803773BB-12E9-3D42-901A-E48B4C5B058A}">
   <ds:schemaRefs>
     <ds:schemaRef ds:uri="http://customooxmlschemas.google.com/"/>
     <ds:schemaRef ds:uri="http://schemas.openxmlformats.org/officeDocument/2006/relationships"/>

</xml_diff>